<commit_message>
Correct spelling, correct value of two command types
Change-Id: Ide53d804855bf84e3bbab15917bbbe9b1e156233
</commit_message>
<xml_diff>
--- a/Documentation/SEDAP-Express ICD v1.4.6.docx
+++ b/Documentation/SEDAP-Express ICD v1.4.6.docx
@@ -14004,7 +14004,25 @@
           <w:szCs w:val="22"/>
           <w:lang w:val="en-US"/>
         </w:rPr>
-        <w:t>EMISSON;&lt;Number&gt;;&lt;Time&gt;;&lt;Sender&gt;;&lt;Classification&gt;;&lt;Acknowledgement&gt;;</w:t>
+        <w:t>EMISS</w:t>
+      </w:r>
+      <w:r>
+        <w:rPr>
+          <w:rFonts w:ascii="Roboto" w:hAnsi="Roboto" w:cs="Segoe UI"/>
+          <w:sz w:val="22"/>
+          <w:szCs w:val="22"/>
+          <w:lang w:val="en-US"/>
+        </w:rPr>
+        <w:t>I</w:t>
+      </w:r>
+      <w:r>
+        <w:rPr>
+          <w:rFonts w:ascii="Roboto" w:hAnsi="Roboto" w:cs="Segoe UI"/>
+          <w:sz w:val="22"/>
+          <w:szCs w:val="22"/>
+          <w:lang w:val="en-US"/>
+        </w:rPr>
+        <w:t>ON;&lt;Number&gt;;&lt;Time&gt;;&lt;Sender&gt;;&lt;Classification&gt;;&lt;Acknowledgement&gt;;</w:t>
       </w:r>
       <w:r>
         <w:rPr>
@@ -27677,7 +27695,16 @@
                 <w:szCs w:val="22"/>
                 <w:lang w:val="en-US"/>
               </w:rPr>
-              <w:t>11</w:t>
+              <w:t>1</w:t>
+            </w:r>
+            <w:r>
+              <w:rPr>
+                <w:rFonts w:ascii="Roboto" w:hAnsi="Roboto" w:cs="Segoe UI"/>
+                <w:sz w:val="22"/>
+                <w:szCs w:val="22"/>
+                <w:lang w:val="en-US"/>
+              </w:rPr>
+              <w:t>2</w:t>
             </w:r>
           </w:p>
         </w:tc>
@@ -27791,7 +27818,16 @@
                 <w:szCs w:val="22"/>
                 <w:lang w:val="en-US"/>
               </w:rPr>
-              <w:t>12</w:t>
+              <w:t>1</w:t>
+            </w:r>
+            <w:r>
+              <w:rPr>
+                <w:rFonts w:ascii="Roboto" w:hAnsi="Roboto" w:cs="Segoe UI"/>
+                <w:sz w:val="22"/>
+                <w:szCs w:val="22"/>
+                <w:lang w:val="en-US"/>
+              </w:rPr>
+              <w:t>3</w:t>
             </w:r>
           </w:p>
         </w:tc>
@@ -27887,7 +27923,7 @@
                 <w:szCs w:val="22"/>
                 <w:lang w:val="en-US"/>
               </w:rPr>
-              <w:t>3</w:t>
+              <w:t>4</w:t>
             </w:r>
           </w:p>
         </w:tc>
@@ -27983,7 +28019,7 @@
                 <w:szCs w:val="22"/>
                 <w:lang w:val="en-US"/>
               </w:rPr>
-              <w:t>4</w:t>
+              <w:t>5</w:t>
             </w:r>
           </w:p>
         </w:tc>
@@ -28124,7 +28160,7 @@
                 <w:szCs w:val="22"/>
                 <w:lang w:val="en-US"/>
               </w:rPr>
-              <w:t>5</w:t>
+              <w:t>6</w:t>
             </w:r>
           </w:p>
         </w:tc>
@@ -31944,7 +31980,7 @@
                 <w:szCs w:val="22"/>
                 <w:lang w:val="en-US"/>
               </w:rPr>
-              <w:t>7</w:t>
+              <w:t>4</w:t>
             </w:r>
           </w:p>
         </w:tc>
@@ -41574,7 +41610,7 @@
           <v:shape id="_x0000_i1025" type="#_x0000_t75" style="width:376.3pt;height:228.85pt" o:ole="">
             <v:imagedata r:id="rId12" o:title=""/>
           </v:shape>
-          <o:OLEObject Type="Embed" ProgID="Visio.Drawing.15" ShapeID="_x0000_i1025" DrawAspect="Content" ObjectID="_1849783641" r:id="rId13"/>
+          <o:OLEObject Type="Embed" ProgID="Visio.Drawing.15" ShapeID="_x0000_i1025" DrawAspect="Content" ObjectID="_1850073799" r:id="rId13"/>
         </w:object>
       </w:r>
     </w:p>
@@ -44580,7 +44616,7 @@
           <v:shape id="_x0000_i1026" type="#_x0000_t75" style="width:608.15pt;height:417pt" o:ole="">
             <v:imagedata r:id="rId15" o:title=""/>
           </v:shape>
-          <o:OLEObject Type="Embed" ProgID="Visio.Drawing.15" ShapeID="_x0000_i1026" DrawAspect="Content" ObjectID="_1849783642" r:id="rId16"/>
+          <o:OLEObject Type="Embed" ProgID="Visio.Drawing.15" ShapeID="_x0000_i1026" DrawAspect="Content" ObjectID="_1850073800" r:id="rId16"/>
         </w:object>
       </w:r>
     </w:p>
@@ -47120,7 +47156,14 @@
         <w:rFonts w:ascii="Roboto" w:hAnsi="Roboto"/>
         <w:lang w:val="en-US"/>
       </w:rPr>
-      <w:t>01</w:t>
+      <w:t>0</w:t>
+    </w:r>
+    <w:r>
+      <w:rPr>
+        <w:rFonts w:ascii="Roboto" w:hAnsi="Roboto"/>
+        <w:lang w:val="en-US"/>
+      </w:rPr>
+      <w:t>5</w:t>
     </w:r>
     <w:r>
       <w:rPr>

</xml_diff>